<commit_message>
Fixed use case diagram
</commit_message>
<xml_diff>
--- a/Documentation.docx
+++ b/Documentation.docx
@@ -187,7 +187,7 @@
           </mc:Choice>
           <mc:Fallback>
             <w:pict>
-              <v:shape w14:anchorId="32BF2335" id="Graphic 2" o:spid="_x0000_s1026" style="position:absolute;margin-left:70.85pt;margin-top:22.75pt;width:453.55pt;height:1.45pt;z-index:-251659264;visibility:visible;mso-wrap-style:square;mso-wrap-distance-left:0;mso-wrap-distance-top:0;mso-wrap-distance-right:0;mso-wrap-distance-bottom:0;mso-position-horizontal:absolute;mso-position-horizontal-relative:page;mso-position-vertical:absolute;mso-position-vertical-relative:text;v-text-anchor:top" coordsize="5760085,18415" o:gfxdata="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" path="m5759996,l,,,17995r5759996,l5759996,xe" fillcolor="black" stroked="f">
+              <v:shape w14:anchorId="4EB60CFE" id="Graphic 2" o:spid="_x0000_s1026" style="position:absolute;margin-left:70.85pt;margin-top:22.75pt;width:453.55pt;height:1.45pt;z-index:-251659264;visibility:visible;mso-wrap-style:square;mso-wrap-distance-left:0;mso-wrap-distance-top:0;mso-wrap-distance-right:0;mso-wrap-distance-bottom:0;mso-position-horizontal:absolute;mso-position-horizontal-relative:page;mso-position-vertical:absolute;mso-position-vertical-relative:text;v-text-anchor:top" coordsize="5760085,18415" o:gfxdata="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" path="m5759996,l,,,17995r5759996,l5759996,xe" fillcolor="black" stroked="f">
                 <v:path arrowok="t"/>
                 <w10:wrap type="topAndBottom" anchorx="page"/>
               </v:shape>
@@ -352,7 +352,7 @@
           </mc:Choice>
           <mc:Fallback>
             <w:pict>
-              <v:shape w14:anchorId="38487940" id="Graphic 3" o:spid="_x0000_s1026" style="position:absolute;margin-left:70.85pt;margin-top:19.7pt;width:453.55pt;height:1.45pt;z-index:-251655168;visibility:visible;mso-wrap-style:square;mso-wrap-distance-left:0;mso-wrap-distance-top:0;mso-wrap-distance-right:0;mso-wrap-distance-bottom:0;mso-position-horizontal:absolute;mso-position-horizontal-relative:page;mso-position-vertical:absolute;mso-position-vertical-relative:text;v-text-anchor:top" coordsize="5760085,18415" o:gfxdata="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" path="m5759996,l,,,17995r5759996,l5759996,xe" fillcolor="black" stroked="f">
+              <v:shape w14:anchorId="4354AB28" id="Graphic 3" o:spid="_x0000_s1026" style="position:absolute;margin-left:70.85pt;margin-top:19.7pt;width:453.55pt;height:1.45pt;z-index:-251655168;visibility:visible;mso-wrap-style:square;mso-wrap-distance-left:0;mso-wrap-distance-top:0;mso-wrap-distance-right:0;mso-wrap-distance-bottom:0;mso-position-horizontal:absolute;mso-position-horizontal-relative:page;mso-position-vertical:absolute;mso-position-vertical-relative:text;v-text-anchor:top" coordsize="5760085,18415" o:gfxdata="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" path="m5759996,l,,,17995r5759996,l5759996,xe" fillcolor="black" stroked="f">
                 <v:path arrowok="t"/>
                 <w10:wrap type="topAndBottom" anchorx="page"/>
               </v:shape>
@@ -405,14 +405,7 @@
           <w:rFonts w:ascii="Times New Roman" w:hAnsi="Times New Roman" w:cs="Times New Roman"/>
           <w:w w:val="105"/>
         </w:rPr>
-        <w:t xml:space="preserve"> </w:t>
-      </w:r>
-      <w:r>
-        <w:rPr>
-          <w:rFonts w:ascii="Times New Roman" w:hAnsi="Times New Roman" w:cs="Times New Roman"/>
-          <w:w w:val="105"/>
-        </w:rPr>
-        <w:t>Nicula Raul-Emil</w:t>
+        <w:t xml:space="preserve"> Nicula Raul-Emil</w:t>
       </w:r>
     </w:p>
     <w:p>
@@ -798,21 +791,12 @@
           <w:rFonts w:ascii="Times New Roman" w:hAnsi="Times New Roman" w:cs="Times New Roman"/>
         </w:rPr>
       </w:pPr>
-      <w:proofErr w:type="gramStart"/>
       <w:r>
         <w:rPr>
           <w:rFonts w:ascii="Times New Roman" w:hAnsi="Times New Roman" w:cs="Times New Roman"/>
           <w:spacing w:val="20"/>
         </w:rPr>
-        <w:t>March,</w:t>
-      </w:r>
-      <w:proofErr w:type="gramEnd"/>
-      <w:r>
-        <w:rPr>
-          <w:rFonts w:ascii="Times New Roman" w:hAnsi="Times New Roman" w:cs="Times New Roman"/>
-          <w:spacing w:val="20"/>
-        </w:rPr>
-        <w:t xml:space="preserve"> 2026</w:t>
+        <w:t>March, 2026</w:t>
       </w:r>
     </w:p>
     <w:p>
@@ -3522,23 +3506,13 @@
           <w:szCs w:val="24"/>
         </w:rPr>
       </w:pPr>
-      <w:proofErr w:type="spellStart"/>
-      <w:r>
-        <w:rPr>
-          <w:rFonts w:ascii="Times New Roman" w:hAnsi="Times New Roman" w:cs="Times New Roman"/>
-          <w:sz w:val="24"/>
-          <w:szCs w:val="24"/>
-        </w:rPr>
-        <w:t>CarKet</w:t>
-      </w:r>
-      <w:proofErr w:type="spellEnd"/>
-      <w:r>
-        <w:rPr>
-          <w:rFonts w:ascii="Times New Roman" w:hAnsi="Times New Roman" w:cs="Times New Roman"/>
-          <w:sz w:val="24"/>
-          <w:szCs w:val="24"/>
-        </w:rPr>
-        <w:t xml:space="preserve"> is a web-based marketplace built with Spring Boot that helps people buy and sell cars easily. The main goal is to provide a safe platform where users can post ads for their vehicles, upload photos, and search for their next car using filters like brand or model.</w:t>
+      <w:r>
+        <w:rPr>
+          <w:rFonts w:ascii="Times New Roman" w:hAnsi="Times New Roman" w:cs="Times New Roman"/>
+          <w:sz w:val="24"/>
+          <w:szCs w:val="24"/>
+        </w:rPr>
+        <w:t>CarKet is a web-based marketplace built with Spring Boot that helps people buy and sell cars easily. The main goal is to provide a safe platform where users can post ads for their vehicles, upload photos, and search for their next car using filters like brand or model.</w:t>
       </w:r>
     </w:p>
     <w:p>
@@ -3590,26 +3564,32 @@
           <w:sz w:val="24"/>
           <w:szCs w:val="24"/>
         </w:rPr>
-        <w:t>Deliverables I am providing the full Java source code, the HTML</w:t>
-      </w:r>
-      <w:r>
-        <w:rPr>
-          <w:rFonts w:ascii="Times New Roman" w:hAnsi="Times New Roman" w:cs="Times New Roman"/>
-          <w:sz w:val="24"/>
-          <w:szCs w:val="24"/>
-        </w:rPr>
-        <w:t xml:space="preserve">, CSS and </w:t>
-      </w:r>
-      <w:proofErr w:type="spellStart"/>
-      <w:r>
-        <w:rPr>
-          <w:rFonts w:ascii="Times New Roman" w:hAnsi="Times New Roman" w:cs="Times New Roman"/>
-          <w:sz w:val="24"/>
-          <w:szCs w:val="24"/>
-        </w:rPr>
-        <w:t>js</w:t>
-      </w:r>
-      <w:proofErr w:type="spellEnd"/>
+        <w:t>Deliverables</w:t>
+      </w:r>
+      <w:r>
+        <w:rPr>
+          <w:rFonts w:ascii="Times New Roman" w:hAnsi="Times New Roman" w:cs="Times New Roman"/>
+          <w:sz w:val="24"/>
+          <w:szCs w:val="24"/>
+        </w:rPr>
+        <w:t>:</w:t>
+      </w:r>
+      <w:r>
+        <w:rPr>
+          <w:rFonts w:ascii="Times New Roman" w:hAnsi="Times New Roman" w:cs="Times New Roman"/>
+          <w:sz w:val="24"/>
+          <w:szCs w:val="24"/>
+        </w:rPr>
+        <w:t xml:space="preserve"> I am providing the full Java source code, the HTML</w:t>
+      </w:r>
+      <w:r>
+        <w:rPr>
+          <w:rFonts w:ascii="Times New Roman" w:hAnsi="Times New Roman" w:cs="Times New Roman"/>
+          <w:sz w:val="24"/>
+          <w:szCs w:val="24"/>
+        </w:rPr>
+        <w:t>, CSS and js</w:t>
+      </w:r>
       <w:r>
         <w:rPr>
           <w:rFonts w:ascii="Times New Roman" w:hAnsi="Times New Roman" w:cs="Times New Roman"/>
@@ -3626,23 +3606,13 @@
         </w:rPr>
         <w:t xml:space="preserve">documentation </w:t>
       </w:r>
-      <w:proofErr w:type="gramStart"/>
-      <w:r>
-        <w:rPr>
-          <w:rFonts w:ascii="Times New Roman" w:hAnsi="Times New Roman" w:cs="Times New Roman"/>
-          <w:sz w:val="24"/>
-          <w:szCs w:val="24"/>
-        </w:rPr>
-        <w:t>including</w:t>
-      </w:r>
-      <w:proofErr w:type="gramEnd"/>
-      <w:r>
-        <w:rPr>
-          <w:rFonts w:ascii="Times New Roman" w:hAnsi="Times New Roman" w:cs="Times New Roman"/>
-          <w:sz w:val="24"/>
-          <w:szCs w:val="24"/>
-        </w:rPr>
-        <w:t xml:space="preserve"> all necessary diagrams.</w:t>
+      <w:r>
+        <w:rPr>
+          <w:rFonts w:ascii="Times New Roman" w:hAnsi="Times New Roman" w:cs="Times New Roman"/>
+          <w:sz w:val="24"/>
+          <w:szCs w:val="24"/>
+        </w:rPr>
+        <w:t>including all necessary diagrams.</w:t>
       </w:r>
     </w:p>
     <w:p>
@@ -3876,43 +3846,7 @@
           <w:sz w:val="24"/>
           <w:szCs w:val="24"/>
         </w:rPr>
-        <w:t xml:space="preserve">User Authentication and Authorization: The system must allow users to register an account and log in using </w:t>
-      </w:r>
-      <w:proofErr w:type="gramStart"/>
-      <w:r>
-        <w:rPr>
-          <w:rFonts w:ascii="Times New Roman" w:hAnsi="Times New Roman" w:cs="Times New Roman"/>
-          <w:sz w:val="24"/>
-          <w:szCs w:val="24"/>
-        </w:rPr>
-        <w:t>an email</w:t>
-      </w:r>
-      <w:proofErr w:type="gramEnd"/>
-      <w:r>
-        <w:rPr>
-          <w:rFonts w:ascii="Times New Roman" w:hAnsi="Times New Roman" w:cs="Times New Roman"/>
-          <w:sz w:val="24"/>
-          <w:szCs w:val="24"/>
-        </w:rPr>
-        <w:t xml:space="preserve"> and </w:t>
-      </w:r>
-      <w:proofErr w:type="gramStart"/>
-      <w:r>
-        <w:rPr>
-          <w:rFonts w:ascii="Times New Roman" w:hAnsi="Times New Roman" w:cs="Times New Roman"/>
-          <w:sz w:val="24"/>
-          <w:szCs w:val="24"/>
-        </w:rPr>
-        <w:t>password</w:t>
-      </w:r>
-      <w:proofErr w:type="gramEnd"/>
-      <w:r>
-        <w:rPr>
-          <w:rFonts w:ascii="Times New Roman" w:hAnsi="Times New Roman" w:cs="Times New Roman"/>
-          <w:sz w:val="24"/>
-          <w:szCs w:val="24"/>
-        </w:rPr>
-        <w:t>. It must also distinguish between 'Client' and 'Admin' roles to restrict access to specific features.</w:t>
+        <w:t>User Authentication and Authorization: The system must allow users to register an account and log in using an email and password. It must also distinguish between 'Client' and 'Admin' roles to restrict access to specific features.</w:t>
       </w:r>
     </w:p>
     <w:p>
@@ -4260,25 +4194,7 @@
           <w:sz w:val="24"/>
           <w:szCs w:val="24"/>
         </w:rPr>
-        <w:t xml:space="preserve">Actor: </w:t>
-      </w:r>
-      <w:proofErr w:type="gramStart"/>
-      <w:r>
-        <w:rPr>
-          <w:rFonts w:ascii="Times New Roman" w:hAnsi="Times New Roman" w:cs="Times New Roman"/>
-          <w:sz w:val="24"/>
-          <w:szCs w:val="24"/>
-        </w:rPr>
-        <w:t>Client(</w:t>
-      </w:r>
-      <w:proofErr w:type="gramEnd"/>
-      <w:r>
-        <w:rPr>
-          <w:rFonts w:ascii="Times New Roman" w:hAnsi="Times New Roman" w:cs="Times New Roman"/>
-          <w:sz w:val="24"/>
-          <w:szCs w:val="24"/>
-        </w:rPr>
-        <w:t>Registered User)</w:t>
+        <w:t>Actor: Client(Registered User)</w:t>
       </w:r>
     </w:p>
     <w:p>
@@ -4604,25 +4520,7 @@
           <w:sz w:val="24"/>
           <w:szCs w:val="24"/>
         </w:rPr>
-        <w:t xml:space="preserve">Description: The owner of an ad opens the details page, enters a new price in the edit </w:t>
-      </w:r>
-      <w:proofErr w:type="gramStart"/>
-      <w:r>
-        <w:rPr>
-          <w:rFonts w:ascii="Times New Roman" w:hAnsi="Times New Roman" w:cs="Times New Roman"/>
-          <w:sz w:val="24"/>
-          <w:szCs w:val="24"/>
-        </w:rPr>
-        <w:t>modal</w:t>
-      </w:r>
-      <w:proofErr w:type="gramEnd"/>
-      <w:r>
-        <w:rPr>
-          <w:rFonts w:ascii="Times New Roman" w:hAnsi="Times New Roman" w:cs="Times New Roman"/>
-          <w:sz w:val="24"/>
-          <w:szCs w:val="24"/>
-        </w:rPr>
-        <w:t>, and submits the update.</w:t>
+        <w:t>Description: The owner of an ad opens the details page, enters a new price in the edit modal, and submits the update.</w:t>
       </w:r>
     </w:p>
     <w:p>
@@ -4722,25 +4620,7 @@
           <w:sz w:val="24"/>
           <w:szCs w:val="24"/>
         </w:rPr>
-        <w:t xml:space="preserve">Description: The actor selects the </w:t>
-      </w:r>
-      <w:proofErr w:type="gramStart"/>
-      <w:r>
-        <w:rPr>
-          <w:rFonts w:ascii="Times New Roman" w:hAnsi="Times New Roman" w:cs="Times New Roman"/>
-          <w:sz w:val="24"/>
-          <w:szCs w:val="24"/>
-        </w:rPr>
-        <w:t>delete</w:t>
-      </w:r>
-      <w:proofErr w:type="gramEnd"/>
-      <w:r>
-        <w:rPr>
-          <w:rFonts w:ascii="Times New Roman" w:hAnsi="Times New Roman" w:cs="Times New Roman"/>
-          <w:sz w:val="24"/>
-          <w:szCs w:val="24"/>
-        </w:rPr>
-        <w:t xml:space="preserve"> option on a specific advertisement's details page.</w:t>
+        <w:t>Description: The actor selects the delete option on a specific advertisement's details page.</w:t>
       </w:r>
     </w:p>
     <w:p>
@@ -4784,24 +4664,24 @@
     <w:p>
       <w:pPr>
         <w:pStyle w:val="BodyText"/>
-        <w:rPr>
-          <w:rFonts w:ascii="Times New Roman" w:eastAsia="Times New Roman" w:hAnsi="Times New Roman" w:cs="Times New Roman"/>
-          <w:sz w:val="24"/>
-          <w:szCs w:val="24"/>
-        </w:rPr>
-      </w:pPr>
-      <w:r>
-        <w:rPr>
-          <w:rFonts w:ascii="Times New Roman" w:eastAsia="Times New Roman" w:hAnsi="Times New Roman" w:cs="Times New Roman"/>
-          <w:noProof/>
+        <w:jc w:val="center"/>
+        <w:rPr>
+          <w:rFonts w:ascii="Times New Roman" w:eastAsia="Times New Roman" w:hAnsi="Times New Roman" w:cs="Times New Roman"/>
+          <w:sz w:val="24"/>
+          <w:szCs w:val="24"/>
+        </w:rPr>
+      </w:pPr>
+      <w:r>
+        <w:rPr>
+          <w:rFonts w:ascii="Times New Roman" w:eastAsia="Times New Roman" w:hAnsi="Times New Roman" w:cs="Times New Roman"/>
           <w:sz w:val="24"/>
           <w:szCs w:val="24"/>
         </w:rPr>
         <w:drawing>
-          <wp:inline distT="0" distB="0" distL="0" distR="0" wp14:anchorId="11BF3A6B" wp14:editId="506EBF88">
-            <wp:extent cx="5943600" cy="623570"/>
-            <wp:effectExtent l="0" t="0" r="0" b="5080"/>
-            <wp:docPr id="1561409462" name="Picture 1"/>
+          <wp:inline distT="0" distB="0" distL="0" distR="0" wp14:anchorId="3DBB2AF4" wp14:editId="6BF684C9">
+            <wp:extent cx="1770649" cy="3213613"/>
+            <wp:effectExtent l="0" t="0" r="1270" b="6350"/>
+            <wp:docPr id="408832680" name="Picture 1"/>
             <wp:cNvGraphicFramePr>
               <a:graphicFrameLocks xmlns:a="http://schemas.openxmlformats.org/drawingml/2006/main" noChangeAspect="1"/>
             </wp:cNvGraphicFramePr>
@@ -4809,17 +4689,11 @@
               <a:graphicData uri="http://schemas.openxmlformats.org/drawingml/2006/picture">
                 <pic:pic xmlns:pic="http://schemas.openxmlformats.org/drawingml/2006/picture">
                   <pic:nvPicPr>
-                    <pic:cNvPr id="1561409462" name="Picture 1561409462"/>
+                    <pic:cNvPr id="408832680" name=""/>
                     <pic:cNvPicPr/>
                   </pic:nvPicPr>
                   <pic:blipFill>
-                    <a:blip r:embed="rId9" cstate="print">
-                      <a:extLst>
-                        <a:ext uri="{28A0092B-C50C-407E-A947-70E740481C1C}">
-                          <a14:useLocalDpi xmlns:a14="http://schemas.microsoft.com/office/drawing/2010/main" val="0"/>
-                        </a:ext>
-                      </a:extLst>
-                    </a:blip>
+                    <a:blip r:embed="rId9"/>
                     <a:stretch>
                       <a:fillRect/>
                     </a:stretch>
@@ -4827,7 +4701,7 @@
                   <pic:spPr>
                     <a:xfrm>
                       <a:off x="0" y="0"/>
-                      <a:ext cx="5943600" cy="623570"/>
+                      <a:ext cx="1778600" cy="3228043"/>
                     </a:xfrm>
                     <a:prstGeom prst="rect">
                       <a:avLst/>
@@ -4972,25 +4846,7 @@
           <w:sz w:val="24"/>
           <w:szCs w:val="24"/>
         </w:rPr>
-        <w:t xml:space="preserve">he </w:t>
-      </w:r>
-      <w:proofErr w:type="spellStart"/>
-      <w:r>
-        <w:rPr>
-          <w:rFonts w:ascii="Times New Roman" w:eastAsia="Times New Roman" w:hAnsi="Times New Roman" w:cs="Times New Roman"/>
-          <w:sz w:val="24"/>
-          <w:szCs w:val="24"/>
-        </w:rPr>
-        <w:t>CarKet</w:t>
-      </w:r>
-      <w:proofErr w:type="spellEnd"/>
-      <w:r>
-        <w:rPr>
-          <w:rFonts w:ascii="Times New Roman" w:eastAsia="Times New Roman" w:hAnsi="Times New Roman" w:cs="Times New Roman"/>
-          <w:sz w:val="24"/>
-          <w:szCs w:val="24"/>
-        </w:rPr>
-        <w:t xml:space="preserve"> application follows a Monolithic Client-Server architecture, specifically utilizing a Layered (n-tier) approach to separate concerns and improve maintainability. The system is divided into three major components:</w:t>
+        <w:t>he CarKet application follows a Monolithic Client-Server architecture, specifically utilizing a Layered (n-tier) approach to separate concerns and improve maintainability. The system is divided into three major components:</w:t>
       </w:r>
     </w:p>
     <w:p>
@@ -5015,25 +4871,7 @@
           <w:sz w:val="24"/>
           <w:szCs w:val="24"/>
         </w:rPr>
-        <w:t xml:space="preserve">Frontend: A web-based interface built with </w:t>
-      </w:r>
-      <w:proofErr w:type="spellStart"/>
-      <w:r>
-        <w:rPr>
-          <w:rFonts w:ascii="Times New Roman" w:eastAsia="Times New Roman" w:hAnsi="Times New Roman" w:cs="Times New Roman"/>
-          <w:sz w:val="24"/>
-          <w:szCs w:val="24"/>
-        </w:rPr>
-        <w:t>Thymeleaf</w:t>
-      </w:r>
-      <w:proofErr w:type="spellEnd"/>
-      <w:r>
-        <w:rPr>
-          <w:rFonts w:ascii="Times New Roman" w:eastAsia="Times New Roman" w:hAnsi="Times New Roman" w:cs="Times New Roman"/>
-          <w:sz w:val="24"/>
-          <w:szCs w:val="24"/>
-        </w:rPr>
-        <w:t xml:space="preserve"> templates, CSS, and JavaScript. It handles user interactions and sends requests to the backend via standard HTTP forms or asynchronous fetch calls.</w:t>
+        <w:t>Frontend: A web-based interface built with Thymeleaf templates, CSS, and JavaScript. It handles user interactions and sends requests to the backend via standard HTTP forms or asynchronous fetch calls.</w:t>
       </w:r>
     </w:p>
     <w:p>
@@ -5083,25 +4921,8 @@
           <w:sz w:val="24"/>
           <w:szCs w:val="24"/>
         </w:rPr>
-        <w:t xml:space="preserve">Database: A PostgreSQL relational database used to </w:t>
-      </w:r>
-      <w:proofErr w:type="gramStart"/>
-      <w:r>
-        <w:rPr>
-          <w:rFonts w:ascii="Times New Roman" w:eastAsia="Times New Roman" w:hAnsi="Times New Roman" w:cs="Times New Roman"/>
-          <w:sz w:val="24"/>
-          <w:szCs w:val="24"/>
-        </w:rPr>
-        <w:t>persist</w:t>
-      </w:r>
-      <w:proofErr w:type="gramEnd"/>
-      <w:r>
-        <w:rPr>
-          <w:rFonts w:ascii="Times New Roman" w:eastAsia="Times New Roman" w:hAnsi="Times New Roman" w:cs="Times New Roman"/>
-          <w:sz w:val="24"/>
-          <w:szCs w:val="24"/>
-        </w:rPr>
-        <w:t xml:space="preserve"> user accounts, car details, and advertisement records.</w:t>
+        <w:lastRenderedPageBreak/>
+        <w:t>Database: A PostgreSQL relational database used to persist user accounts, car details, and advertisement records.</w:t>
       </w:r>
     </w:p>
     <w:p>
@@ -5155,25 +4976,7 @@
           <w:sz w:val="24"/>
           <w:szCs w:val="24"/>
         </w:rPr>
-        <w:t xml:space="preserve">Model: This component consists of </w:t>
-      </w:r>
-      <w:proofErr w:type="gramStart"/>
-      <w:r>
-        <w:rPr>
-          <w:rFonts w:ascii="Times New Roman" w:eastAsia="Times New Roman" w:hAnsi="Times New Roman" w:cs="Times New Roman"/>
-          <w:sz w:val="24"/>
-          <w:szCs w:val="24"/>
-        </w:rPr>
-        <w:t>the data</w:t>
-      </w:r>
-      <w:proofErr w:type="gramEnd"/>
-      <w:r>
-        <w:rPr>
-          <w:rFonts w:ascii="Times New Roman" w:eastAsia="Times New Roman" w:hAnsi="Times New Roman" w:cs="Times New Roman"/>
-          <w:sz w:val="24"/>
-          <w:szCs w:val="24"/>
-        </w:rPr>
-        <w:t xml:space="preserve"> structures and business logic. It includes the database entities such as User, Car, and Advertisement, as well as the Data Access Layer that manages these objects.</w:t>
+        <w:t>Model: This component consists of the data structures and business logic. It includes the database entities such as User, Car, and Advertisement, as well as the Data Access Layer that manages these objects.</w:t>
       </w:r>
     </w:p>
     <w:p>
@@ -5198,25 +5001,7 @@
           <w:sz w:val="24"/>
           <w:szCs w:val="24"/>
         </w:rPr>
-        <w:t xml:space="preserve">View: This is the presentation layer that displays the data to the user. It is implemented using </w:t>
-      </w:r>
-      <w:proofErr w:type="spellStart"/>
-      <w:r>
-        <w:rPr>
-          <w:rFonts w:ascii="Times New Roman" w:eastAsia="Times New Roman" w:hAnsi="Times New Roman" w:cs="Times New Roman"/>
-          <w:sz w:val="24"/>
-          <w:szCs w:val="24"/>
-        </w:rPr>
-        <w:t>Thymeleaf</w:t>
-      </w:r>
-      <w:proofErr w:type="spellEnd"/>
-      <w:r>
-        <w:rPr>
-          <w:rFonts w:ascii="Times New Roman" w:eastAsia="Times New Roman" w:hAnsi="Times New Roman" w:cs="Times New Roman"/>
-          <w:sz w:val="24"/>
-          <w:szCs w:val="24"/>
-        </w:rPr>
-        <w:t xml:space="preserve"> templates, which render the final HTML pages like the search results or the advertisement details.</w:t>
+        <w:t>View: This is the presentation layer that displays the data to the user. It is implemented using Thymeleaf templates, which render the final HTML pages like the search results or the advertisement details.</w:t>
       </w:r>
     </w:p>
     <w:p>
@@ -5241,16 +5026,7 @@
           <w:sz w:val="24"/>
           <w:szCs w:val="24"/>
         </w:rPr>
-        <w:t xml:space="preserve">Controller: This layer acts as the interface between the Model and the View. It receives </w:t>
-      </w:r>
-      <w:r>
-        <w:rPr>
-          <w:rFonts w:ascii="Times New Roman" w:eastAsia="Times New Roman" w:hAnsi="Times New Roman" w:cs="Times New Roman"/>
-          <w:sz w:val="24"/>
-          <w:szCs w:val="24"/>
-        </w:rPr>
-        <w:lastRenderedPageBreak/>
-        <w:t>user input from the browser, calls the appropriate Service Layer logic, and then decides which View to display or which data to return.</w:t>
+        <w:t>Controller: This layer acts as the interface between the Model and the View. It receives user input from the browser, calls the appropriate Service Layer logic, and then decides which View to display or which data to return.</w:t>
       </w:r>
     </w:p>
     <w:p>
@@ -5348,43 +5124,7 @@
           <w:sz w:val="24"/>
           <w:szCs w:val="24"/>
         </w:rPr>
-        <w:t xml:space="preserve">The </w:t>
-      </w:r>
-      <w:proofErr w:type="spellStart"/>
-      <w:r>
-        <w:rPr>
-          <w:rFonts w:ascii="Times New Roman" w:eastAsia="Times New Roman" w:hAnsi="Times New Roman" w:cs="Times New Roman"/>
-          <w:sz w:val="24"/>
-          <w:szCs w:val="24"/>
-        </w:rPr>
-        <w:t>CarKet</w:t>
-      </w:r>
-      <w:proofErr w:type="spellEnd"/>
-      <w:r>
-        <w:rPr>
-          <w:rFonts w:ascii="Times New Roman" w:eastAsia="Times New Roman" w:hAnsi="Times New Roman" w:cs="Times New Roman"/>
-          <w:sz w:val="24"/>
-          <w:szCs w:val="24"/>
-        </w:rPr>
-        <w:t xml:space="preserve"> application uses a relational database schema managed via Hibernate and Spring Data JPA to </w:t>
-      </w:r>
-      <w:proofErr w:type="gramStart"/>
-      <w:r>
-        <w:rPr>
-          <w:rFonts w:ascii="Times New Roman" w:eastAsia="Times New Roman" w:hAnsi="Times New Roman" w:cs="Times New Roman"/>
-          <w:sz w:val="24"/>
-          <w:szCs w:val="24"/>
-        </w:rPr>
-        <w:t>persist</w:t>
-      </w:r>
-      <w:proofErr w:type="gramEnd"/>
-      <w:r>
-        <w:rPr>
-          <w:rFonts w:ascii="Times New Roman" w:eastAsia="Times New Roman" w:hAnsi="Times New Roman" w:cs="Times New Roman"/>
-          <w:sz w:val="24"/>
-          <w:szCs w:val="24"/>
-        </w:rPr>
-        <w:t xml:space="preserve"> user data, vehicle information, and marketplace listings. The schema consists of the following primary tables and their relationships:</w:t>
+        <w:t>The CarKet application uses a relational database schema managed via Hibernate and Spring Data JPA to persist user data, vehicle information, and marketplace listings. The schema consists of the following primary tables and their relationships:</w:t>
       </w:r>
     </w:p>
     <w:p>
@@ -5462,51 +5202,15 @@
           <w:sz w:val="24"/>
           <w:szCs w:val="24"/>
         </w:rPr>
-        <w:t xml:space="preserve">-Attributes: </w:t>
-      </w:r>
-      <w:proofErr w:type="gramStart"/>
-      <w:r>
-        <w:rPr>
-          <w:rFonts w:ascii="Times New Roman" w:eastAsia="Times New Roman" w:hAnsi="Times New Roman" w:cs="Times New Roman"/>
-          <w:sz w:val="24"/>
-          <w:szCs w:val="24"/>
-        </w:rPr>
-        <w:t>id(</w:t>
-      </w:r>
-      <w:proofErr w:type="gramEnd"/>
-      <w:r>
-        <w:rPr>
-          <w:rFonts w:ascii="Times New Roman" w:eastAsia="Times New Roman" w:hAnsi="Times New Roman" w:cs="Times New Roman"/>
-          <w:sz w:val="24"/>
-          <w:szCs w:val="24"/>
-        </w:rPr>
-        <w:t xml:space="preserve">primary key), </w:t>
-      </w:r>
-      <w:r>
-        <w:rPr>
-          <w:rFonts w:ascii="Times New Roman" w:eastAsia="Times New Roman" w:hAnsi="Times New Roman" w:cs="Times New Roman"/>
-          <w:sz w:val="24"/>
-          <w:szCs w:val="24"/>
-        </w:rPr>
-        <w:t xml:space="preserve">email(string), password(string), </w:t>
-      </w:r>
-      <w:proofErr w:type="gramStart"/>
-      <w:r>
-        <w:rPr>
-          <w:rFonts w:ascii="Times New Roman" w:eastAsia="Times New Roman" w:hAnsi="Times New Roman" w:cs="Times New Roman"/>
-          <w:sz w:val="24"/>
-          <w:szCs w:val="24"/>
-        </w:rPr>
-        <w:t>role(</w:t>
-      </w:r>
-      <w:proofErr w:type="gramEnd"/>
-      <w:r>
-        <w:rPr>
-          <w:rFonts w:ascii="Times New Roman" w:eastAsia="Times New Roman" w:hAnsi="Times New Roman" w:cs="Times New Roman"/>
-          <w:sz w:val="24"/>
-          <w:szCs w:val="24"/>
-        </w:rPr>
-        <w:t>Client or Admin)</w:t>
+        <w:t xml:space="preserve">-Attributes: id(primary key), </w:t>
+      </w:r>
+      <w:r>
+        <w:rPr>
+          <w:rFonts w:ascii="Times New Roman" w:eastAsia="Times New Roman" w:hAnsi="Times New Roman" w:cs="Times New Roman"/>
+          <w:sz w:val="24"/>
+          <w:szCs w:val="24"/>
+        </w:rPr>
+        <w:t>email(string), password(string), role(Client or Admin)</w:t>
       </w:r>
     </w:p>
     <w:p>
@@ -5616,25 +5320,7 @@
           <w:sz w:val="24"/>
           <w:szCs w:val="24"/>
         </w:rPr>
-        <w:t xml:space="preserve">-Attributes: </w:t>
-      </w:r>
-      <w:proofErr w:type="gramStart"/>
-      <w:r>
-        <w:rPr>
-          <w:rFonts w:ascii="Times New Roman" w:eastAsia="Times New Roman" w:hAnsi="Times New Roman" w:cs="Times New Roman"/>
-          <w:sz w:val="24"/>
-          <w:szCs w:val="24"/>
-        </w:rPr>
-        <w:t>id(</w:t>
-      </w:r>
-      <w:proofErr w:type="gramEnd"/>
-      <w:r>
-        <w:rPr>
-          <w:rFonts w:ascii="Times New Roman" w:eastAsia="Times New Roman" w:hAnsi="Times New Roman" w:cs="Times New Roman"/>
-          <w:sz w:val="24"/>
-          <w:szCs w:val="24"/>
-        </w:rPr>
-        <w:t>primary key), brand(string), model(string), chassis(string)</w:t>
+        <w:t>-Attributes: id(primary key), brand(string), model(string), chassis(string)</w:t>
       </w:r>
     </w:p>
     <w:p>
@@ -5654,25 +5340,7 @@
           <w:sz w:val="24"/>
           <w:szCs w:val="24"/>
         </w:rPr>
-        <w:t>-Relationships</w:t>
-      </w:r>
-      <w:proofErr w:type="gramStart"/>
-      <w:r>
-        <w:rPr>
-          <w:rFonts w:ascii="Times New Roman" w:eastAsia="Times New Roman" w:hAnsi="Times New Roman" w:cs="Times New Roman"/>
-          <w:sz w:val="24"/>
-          <w:szCs w:val="24"/>
-        </w:rPr>
-        <w:t>: :</w:t>
-      </w:r>
-      <w:proofErr w:type="gramEnd"/>
-      <w:r>
-        <w:rPr>
-          <w:rFonts w:ascii="Times New Roman" w:eastAsia="Times New Roman" w:hAnsi="Times New Roman" w:cs="Times New Roman"/>
-          <w:sz w:val="24"/>
-          <w:szCs w:val="24"/>
-        </w:rPr>
-        <w:t xml:space="preserve"> Has a one-to-many relationship with the Advertisements table, as multiple different ads can feature the same car model.</w:t>
+        <w:t>-Relationships: : Has a one-to-many relationship with the Advertisements table, as multiple different ads can feature the same car model.</w:t>
       </w:r>
     </w:p>
     <w:p>
@@ -5754,117 +5422,7 @@
           <w:sz w:val="24"/>
           <w:szCs w:val="24"/>
         </w:rPr>
-        <w:t xml:space="preserve">-Attributes: </w:t>
-      </w:r>
-      <w:proofErr w:type="gramStart"/>
-      <w:r>
-        <w:rPr>
-          <w:rFonts w:ascii="Times New Roman" w:eastAsia="Times New Roman" w:hAnsi="Times New Roman" w:cs="Times New Roman"/>
-          <w:sz w:val="24"/>
-          <w:szCs w:val="24"/>
-        </w:rPr>
-        <w:t>id(</w:t>
-      </w:r>
-      <w:proofErr w:type="gramEnd"/>
-      <w:r>
-        <w:rPr>
-          <w:rFonts w:ascii="Times New Roman" w:eastAsia="Times New Roman" w:hAnsi="Times New Roman" w:cs="Times New Roman"/>
-          <w:sz w:val="24"/>
-          <w:szCs w:val="24"/>
-        </w:rPr>
-        <w:t xml:space="preserve">primary key), year(int), price(int), </w:t>
-      </w:r>
-      <w:proofErr w:type="spellStart"/>
-      <w:r>
-        <w:rPr>
-          <w:rFonts w:ascii="Times New Roman" w:eastAsia="Times New Roman" w:hAnsi="Times New Roman" w:cs="Times New Roman"/>
-          <w:sz w:val="24"/>
-          <w:szCs w:val="24"/>
-        </w:rPr>
-        <w:t>user_</w:t>
-      </w:r>
-      <w:proofErr w:type="gramStart"/>
-      <w:r>
-        <w:rPr>
-          <w:rFonts w:ascii="Times New Roman" w:eastAsia="Times New Roman" w:hAnsi="Times New Roman" w:cs="Times New Roman"/>
-          <w:sz w:val="24"/>
-          <w:szCs w:val="24"/>
-        </w:rPr>
-        <w:t>id</w:t>
-      </w:r>
-      <w:proofErr w:type="spellEnd"/>
-      <w:r>
-        <w:rPr>
-          <w:rFonts w:ascii="Times New Roman" w:eastAsia="Times New Roman" w:hAnsi="Times New Roman" w:cs="Times New Roman"/>
-          <w:sz w:val="24"/>
-          <w:szCs w:val="24"/>
-        </w:rPr>
-        <w:t>(</w:t>
-      </w:r>
-      <w:proofErr w:type="spellStart"/>
-      <w:proofErr w:type="gramEnd"/>
-      <w:r>
-        <w:rPr>
-          <w:rFonts w:ascii="Times New Roman" w:eastAsia="Times New Roman" w:hAnsi="Times New Roman" w:cs="Times New Roman"/>
-          <w:sz w:val="24"/>
-          <w:szCs w:val="24"/>
-        </w:rPr>
-        <w:t>fk</w:t>
-      </w:r>
-      <w:proofErr w:type="spellEnd"/>
-      <w:r>
-        <w:rPr>
-          <w:rFonts w:ascii="Times New Roman" w:eastAsia="Times New Roman" w:hAnsi="Times New Roman" w:cs="Times New Roman"/>
-          <w:sz w:val="24"/>
-          <w:szCs w:val="24"/>
-        </w:rPr>
-        <w:t xml:space="preserve"> referencing user), </w:t>
-      </w:r>
-      <w:proofErr w:type="spellStart"/>
-      <w:r>
-        <w:rPr>
-          <w:rFonts w:ascii="Times New Roman" w:eastAsia="Times New Roman" w:hAnsi="Times New Roman" w:cs="Times New Roman"/>
-          <w:sz w:val="24"/>
-          <w:szCs w:val="24"/>
-        </w:rPr>
-        <w:t>car_</w:t>
-      </w:r>
-      <w:proofErr w:type="gramStart"/>
-      <w:r>
-        <w:rPr>
-          <w:rFonts w:ascii="Times New Roman" w:eastAsia="Times New Roman" w:hAnsi="Times New Roman" w:cs="Times New Roman"/>
-          <w:sz w:val="24"/>
-          <w:szCs w:val="24"/>
-        </w:rPr>
-        <w:t>id</w:t>
-      </w:r>
-      <w:proofErr w:type="spellEnd"/>
-      <w:r>
-        <w:rPr>
-          <w:rFonts w:ascii="Times New Roman" w:eastAsia="Times New Roman" w:hAnsi="Times New Roman" w:cs="Times New Roman"/>
-          <w:sz w:val="24"/>
-          <w:szCs w:val="24"/>
-        </w:rPr>
-        <w:t>(</w:t>
-      </w:r>
-      <w:proofErr w:type="spellStart"/>
-      <w:proofErr w:type="gramEnd"/>
-      <w:r>
-        <w:rPr>
-          <w:rFonts w:ascii="Times New Roman" w:eastAsia="Times New Roman" w:hAnsi="Times New Roman" w:cs="Times New Roman"/>
-          <w:sz w:val="24"/>
-          <w:szCs w:val="24"/>
-        </w:rPr>
-        <w:t>fk</w:t>
-      </w:r>
-      <w:proofErr w:type="spellEnd"/>
-      <w:r>
-        <w:rPr>
-          <w:rFonts w:ascii="Times New Roman" w:eastAsia="Times New Roman" w:hAnsi="Times New Roman" w:cs="Times New Roman"/>
-          <w:sz w:val="24"/>
-          <w:szCs w:val="24"/>
-        </w:rPr>
-        <w:t xml:space="preserve"> referencing car)</w:t>
+        <w:t>-Attributes: id(primary key), year(int), price(int), user_id(fk referencing user), car_id(fk referencing car)</w:t>
       </w:r>
     </w:p>
     <w:p>
@@ -6006,25 +5564,7 @@
           <w:sz w:val="24"/>
           <w:szCs w:val="24"/>
         </w:rPr>
-        <w:t>- An auxiliary table (</w:t>
-      </w:r>
-      <w:proofErr w:type="spellStart"/>
-      <w:r>
-        <w:rPr>
-          <w:rFonts w:ascii="Times New Roman" w:eastAsia="Times New Roman" w:hAnsi="Times New Roman" w:cs="Times New Roman"/>
-          <w:sz w:val="24"/>
-          <w:szCs w:val="24"/>
-        </w:rPr>
-        <w:t>ElementCollection</w:t>
-      </w:r>
-      <w:proofErr w:type="spellEnd"/>
-      <w:r>
-        <w:rPr>
-          <w:rFonts w:ascii="Times New Roman" w:eastAsia="Times New Roman" w:hAnsi="Times New Roman" w:cs="Times New Roman"/>
-          <w:sz w:val="24"/>
-          <w:szCs w:val="24"/>
-        </w:rPr>
-        <w:t>) that stores the file paths for images associated with an advertisement.</w:t>
+        <w:t>- An auxiliary table (ElementCollection) that stores the file paths for images associated with an advertisement.</w:t>
       </w:r>
     </w:p>
     <w:p>
@@ -6044,53 +5584,8 @@
           <w:sz w:val="24"/>
           <w:szCs w:val="24"/>
         </w:rPr>
-        <w:t xml:space="preserve">-Attributes: </w:t>
-      </w:r>
-      <w:proofErr w:type="spellStart"/>
-      <w:r>
-        <w:rPr>
-          <w:rFonts w:ascii="Times New Roman" w:eastAsia="Times New Roman" w:hAnsi="Times New Roman" w:cs="Times New Roman"/>
-          <w:sz w:val="24"/>
-          <w:szCs w:val="24"/>
-        </w:rPr>
-        <w:t>advertisement_</w:t>
-      </w:r>
-      <w:proofErr w:type="gramStart"/>
-      <w:r>
-        <w:rPr>
-          <w:rFonts w:ascii="Times New Roman" w:eastAsia="Times New Roman" w:hAnsi="Times New Roman" w:cs="Times New Roman"/>
-          <w:sz w:val="24"/>
-          <w:szCs w:val="24"/>
-        </w:rPr>
-        <w:t>id</w:t>
-      </w:r>
-      <w:proofErr w:type="spellEnd"/>
-      <w:r>
-        <w:rPr>
-          <w:rFonts w:ascii="Times New Roman" w:eastAsia="Times New Roman" w:hAnsi="Times New Roman" w:cs="Times New Roman"/>
-          <w:sz w:val="24"/>
-          <w:szCs w:val="24"/>
-        </w:rPr>
-        <w:t>(</w:t>
-      </w:r>
-      <w:proofErr w:type="spellStart"/>
-      <w:proofErr w:type="gramEnd"/>
-      <w:r>
-        <w:rPr>
-          <w:rFonts w:ascii="Times New Roman" w:eastAsia="Times New Roman" w:hAnsi="Times New Roman" w:cs="Times New Roman"/>
-          <w:sz w:val="24"/>
-          <w:szCs w:val="24"/>
-        </w:rPr>
-        <w:t>fk</w:t>
-      </w:r>
-      <w:proofErr w:type="spellEnd"/>
-      <w:r>
-        <w:rPr>
-          <w:rFonts w:ascii="Times New Roman" w:eastAsia="Times New Roman" w:hAnsi="Times New Roman" w:cs="Times New Roman"/>
-          <w:sz w:val="24"/>
-          <w:szCs w:val="24"/>
-        </w:rPr>
-        <w:t xml:space="preserve"> referencing ad), images(string)</w:t>
+        <w:lastRenderedPageBreak/>
+        <w:t>-Attributes: advertisement_id(fk referencing ad), images(string)</w:t>
       </w:r>
     </w:p>
     <w:p>
@@ -6132,7 +5627,6 @@
           <w:sz w:val="24"/>
           <w:szCs w:val="24"/>
         </w:rPr>
-        <w:lastRenderedPageBreak/>
         <w:drawing>
           <wp:inline distT="0" distB="0" distL="0" distR="0" wp14:anchorId="17A0E0AA" wp14:editId="0A328D98">
             <wp:extent cx="2123008" cy="3314700"/>
@@ -6216,19 +5710,11 @@
         </w:rPr>
       </w:pPr>
       <w:bookmarkStart w:id="14" w:name="_Toc225080877"/>
-      <w:proofErr w:type="gramStart"/>
-      <w:r>
-        <w:rPr>
-          <w:rFonts w:ascii="Times New Roman" w:eastAsia="Times New Roman" w:hAnsi="Times New Roman" w:cs="Times New Roman"/>
-        </w:rPr>
-        <w:t>Advertisement</w:t>
-      </w:r>
-      <w:proofErr w:type="gramEnd"/>
-      <w:r>
-        <w:rPr>
-          <w:rFonts w:ascii="Times New Roman" w:eastAsia="Times New Roman" w:hAnsi="Times New Roman" w:cs="Times New Roman"/>
-        </w:rPr>
-        <w:t xml:space="preserve"> Service</w:t>
+      <w:r>
+        <w:rPr>
+          <w:rFonts w:ascii="Times New Roman" w:eastAsia="Times New Roman" w:hAnsi="Times New Roman" w:cs="Times New Roman"/>
+        </w:rPr>
+        <w:t>Advertisement Service</w:t>
       </w:r>
       <w:bookmarkEnd w:id="14"/>
     </w:p>
@@ -6261,25 +5747,7 @@
           <w:sz w:val="24"/>
           <w:szCs w:val="24"/>
         </w:rPr>
-        <w:t xml:space="preserve">The Advertisement Service is a core backend component of the </w:t>
-      </w:r>
-      <w:proofErr w:type="spellStart"/>
-      <w:r>
-        <w:rPr>
-          <w:rFonts w:ascii="Times New Roman" w:hAnsi="Times New Roman" w:cs="Times New Roman"/>
-          <w:sz w:val="24"/>
-          <w:szCs w:val="24"/>
-        </w:rPr>
-        <w:t>CarKet</w:t>
-      </w:r>
-      <w:proofErr w:type="spellEnd"/>
-      <w:r>
-        <w:rPr>
-          <w:rFonts w:ascii="Times New Roman" w:hAnsi="Times New Roman" w:cs="Times New Roman"/>
-          <w:sz w:val="24"/>
-          <w:szCs w:val="24"/>
-        </w:rPr>
-        <w:t xml:space="preserve"> system, responsible for managing the lifecycle of car listings and enforcing business rules. It acts as an intermediary between the web controllers and the data persistence layer.</w:t>
+        <w:t>The Advertisement Service is a core backend component of the CarKet system, responsible for managing the lifecycle of car listings and enforcing business rules. It acts as an intermediary between the web controllers and the data persistence layer.</w:t>
       </w:r>
     </w:p>
     <w:p>
@@ -6331,7 +5799,6 @@
         </w:rPr>
         <w:t xml:space="preserve">Ad Publication: It coordinates the creation of new listings by processing data from the </w:t>
       </w:r>
-      <w:proofErr w:type="spellStart"/>
       <w:r>
         <w:rPr>
           <w:rFonts w:ascii="Times New Roman" w:eastAsia="Consolas" w:hAnsi="Times New Roman" w:cs="Times New Roman"/>
@@ -6340,7 +5807,6 @@
         </w:rPr>
         <w:t>AdRequestDTO</w:t>
       </w:r>
-      <w:proofErr w:type="spellEnd"/>
       <w:r>
         <w:rPr>
           <w:rFonts w:ascii="Times New Roman" w:hAnsi="Times New Roman" w:cs="Times New Roman"/>
@@ -6431,7 +5897,6 @@
         </w:rPr>
         <w:t xml:space="preserve">Media Management: It interacts with the </w:t>
       </w:r>
-      <w:proofErr w:type="spellStart"/>
       <w:r>
         <w:rPr>
           <w:rFonts w:ascii="Times New Roman" w:eastAsia="Consolas" w:hAnsi="Times New Roman" w:cs="Times New Roman"/>
@@ -6440,7 +5905,6 @@
         </w:rPr>
         <w:t>FileStorageService</w:t>
       </w:r>
-      <w:proofErr w:type="spellEnd"/>
       <w:r>
         <w:rPr>
           <w:rFonts w:ascii="Times New Roman" w:hAnsi="Times New Roman" w:cs="Times New Roman"/>
@@ -6485,7 +5949,6 @@
         </w:rPr>
         <w:t xml:space="preserve">Data Retrieval: It provides filtered search results by communicating with the </w:t>
       </w:r>
-      <w:proofErr w:type="spellStart"/>
       <w:r>
         <w:rPr>
           <w:rFonts w:ascii="Times New Roman" w:eastAsia="Consolas" w:hAnsi="Times New Roman" w:cs="Times New Roman"/>
@@ -6494,7 +5957,6 @@
         </w:rPr>
         <w:t>CarService</w:t>
       </w:r>
-      <w:proofErr w:type="spellEnd"/>
       <w:r>
         <w:rPr>
           <w:rFonts w:ascii="Times New Roman" w:hAnsi="Times New Roman" w:cs="Times New Roman"/>
@@ -6579,25 +6041,7 @@
           <w:sz w:val="24"/>
           <w:szCs w:val="24"/>
         </w:rPr>
-        <w:t xml:space="preserve">The Security Configuration component is a critical infrastructure module that manages access control and identity verification across the entire </w:t>
-      </w:r>
-      <w:proofErr w:type="spellStart"/>
-      <w:r>
-        <w:rPr>
-          <w:rFonts w:ascii="Times New Roman" w:eastAsia="Times New Roman" w:hAnsi="Times New Roman" w:cs="Times New Roman"/>
-          <w:sz w:val="24"/>
-          <w:szCs w:val="24"/>
-        </w:rPr>
-        <w:t>CarKet</w:t>
-      </w:r>
-      <w:proofErr w:type="spellEnd"/>
-      <w:r>
-        <w:rPr>
-          <w:rFonts w:ascii="Times New Roman" w:eastAsia="Times New Roman" w:hAnsi="Times New Roman" w:cs="Times New Roman"/>
-          <w:sz w:val="24"/>
-          <w:szCs w:val="24"/>
-        </w:rPr>
-        <w:t xml:space="preserve"> platform. It sits between the client applications and the backend controllers to protect sensitive resources and data.</w:t>
+        <w:t>The Security Configuration component is a critical infrastructure module that manages access control and identity verification across the entire CarKet platform. It sits between the client applications and the backend controllers to protect sensitive resources and data.</w:t>
       </w:r>
     </w:p>
     <w:p>
@@ -6621,6 +6065,7 @@
           <w:sz w:val="24"/>
           <w:szCs w:val="24"/>
         </w:rPr>
+        <w:lastRenderedPageBreak/>
         <w:t>Functionality Provided</w:t>
       </w:r>
     </w:p>
@@ -6644,16 +6089,7 @@
           <w:sz w:val="24"/>
           <w:szCs w:val="24"/>
         </w:rPr>
-        <w:t xml:space="preserve">Authentication Management: It defines the login process, specifying the custom login </w:t>
-      </w:r>
-      <w:r>
-        <w:rPr>
-          <w:rFonts w:ascii="Times New Roman" w:eastAsia="Times New Roman" w:hAnsi="Times New Roman" w:cs="Times New Roman"/>
-          <w:sz w:val="24"/>
-          <w:szCs w:val="24"/>
-        </w:rPr>
-        <w:lastRenderedPageBreak/>
-        <w:t>page and the logic for handling successful or failed authentication attempts.</w:t>
+        <w:t>Authentication Management: It defines the login process, specifying the custom login page and the logic for handling successful or failed authentication attempts.</w:t>
       </w:r>
     </w:p>
     <w:p>
@@ -6745,25 +6181,7 @@
           <w:sz w:val="24"/>
           <w:szCs w:val="24"/>
         </w:rPr>
-        <w:t xml:space="preserve">Password Encoding: It provides a </w:t>
-      </w:r>
-      <w:proofErr w:type="spellStart"/>
-      <w:r>
-        <w:rPr>
-          <w:rFonts w:ascii="Times New Roman" w:eastAsia="Times New Roman" w:hAnsi="Times New Roman" w:cs="Times New Roman"/>
-          <w:sz w:val="24"/>
-          <w:szCs w:val="24"/>
-        </w:rPr>
-        <w:t>BCryptPasswordEncoder</w:t>
-      </w:r>
-      <w:proofErr w:type="spellEnd"/>
-      <w:r>
-        <w:rPr>
-          <w:rFonts w:ascii="Times New Roman" w:eastAsia="Times New Roman" w:hAnsi="Times New Roman" w:cs="Times New Roman"/>
-          <w:sz w:val="24"/>
-          <w:szCs w:val="24"/>
-        </w:rPr>
-        <w:t xml:space="preserve"> bean to ensure that user passwords are never stored or compared in plain text, maintaining high data integrity.</w:t>
+        <w:t>Password Encoding: It provides a BCryptPasswordEncoder bean to ensure that user passwords are never stored or compared in plain text, maintaining high data integrity.</w:t>
       </w:r>
     </w:p>
     <w:p>
@@ -6981,25 +6399,7 @@
           <w:sz w:val="24"/>
           <w:szCs w:val="24"/>
         </w:rPr>
-        <w:t xml:space="preserve">Most of the classes use </w:t>
-      </w:r>
-      <w:proofErr w:type="gramStart"/>
-      <w:r>
-        <w:rPr>
-          <w:rFonts w:ascii="Times New Roman" w:hAnsi="Times New Roman" w:cs="Times New Roman"/>
-          <w:sz w:val="24"/>
-          <w:szCs w:val="24"/>
-        </w:rPr>
-        <w:t>it,</w:t>
-      </w:r>
-      <w:proofErr w:type="gramEnd"/>
-      <w:r>
-        <w:rPr>
-          <w:rFonts w:ascii="Times New Roman" w:hAnsi="Times New Roman" w:cs="Times New Roman"/>
-          <w:sz w:val="24"/>
-          <w:szCs w:val="24"/>
-        </w:rPr>
-        <w:t xml:space="preserve"> because of the way Spring Boot works, where every Service, Repository, Bean is a singleton by default.</w:t>
+        <w:t>Most of the classes use it, because of the way Spring Boot works, where every Service, Repository, Bean is a singleton by default.</w:t>
       </w:r>
     </w:p>
     <w:p>
@@ -7042,7 +6442,6 @@
           <w:szCs w:val="24"/>
         </w:rPr>
       </w:pPr>
-      <w:proofErr w:type="gramStart"/>
       <w:r>
         <w:rPr>
           <w:rFonts w:ascii="Times New Roman" w:hAnsi="Times New Roman" w:cs="Times New Roman"/>
@@ -7057,16 +6456,7 @@
           <w:sz w:val="24"/>
           <w:szCs w:val="24"/>
         </w:rPr>
-        <w:t>Category</w:t>
-      </w:r>
-      <w:proofErr w:type="gramEnd"/>
-      <w:r>
-        <w:rPr>
-          <w:rFonts w:ascii="Times New Roman" w:hAnsi="Times New Roman" w:cs="Times New Roman"/>
-          <w:sz w:val="24"/>
-          <w:szCs w:val="24"/>
-        </w:rPr>
-        <w:t>: Structural</w:t>
+        <w:t>Category: Structural</w:t>
       </w:r>
     </w:p>
     <w:p>
@@ -7116,43 +6506,7 @@
           <w:sz w:val="24"/>
           <w:szCs w:val="24"/>
         </w:rPr>
-        <w:t xml:space="preserve">It is used in the Repository classes, </w:t>
-      </w:r>
-      <w:proofErr w:type="gramStart"/>
-      <w:r>
-        <w:rPr>
-          <w:rFonts w:ascii="Times New Roman" w:hAnsi="Times New Roman" w:cs="Times New Roman"/>
-          <w:sz w:val="24"/>
-          <w:szCs w:val="24"/>
-        </w:rPr>
-        <w:t>and also</w:t>
-      </w:r>
-      <w:proofErr w:type="gramEnd"/>
-      <w:r>
-        <w:rPr>
-          <w:rFonts w:ascii="Times New Roman" w:hAnsi="Times New Roman" w:cs="Times New Roman"/>
-          <w:sz w:val="24"/>
-          <w:szCs w:val="24"/>
-        </w:rPr>
-        <w:t xml:space="preserve">, </w:t>
-      </w:r>
-      <w:proofErr w:type="gramStart"/>
-      <w:r>
-        <w:rPr>
-          <w:rFonts w:ascii="Times New Roman" w:hAnsi="Times New Roman" w:cs="Times New Roman"/>
-          <w:sz w:val="24"/>
-          <w:szCs w:val="24"/>
-        </w:rPr>
-        <w:t>the @</w:t>
-      </w:r>
-      <w:proofErr w:type="gramEnd"/>
-      <w:r>
-        <w:rPr>
-          <w:rFonts w:ascii="Times New Roman" w:hAnsi="Times New Roman" w:cs="Times New Roman"/>
-          <w:sz w:val="24"/>
-          <w:szCs w:val="24"/>
-        </w:rPr>
-        <w:t>PreAuthorize annotation wraps the class in a proxy.</w:t>
+        <w:t>It is used in the Repository classes, and also, the @PreAuthorize annotation wraps the class in a proxy.</w:t>
       </w:r>
     </w:p>
     <w:p>
@@ -7244,23 +6598,7 @@
           <w:sz w:val="24"/>
           <w:szCs w:val="24"/>
         </w:rPr>
-        <w:t>It allows the step-by-step construction of complex object</w:t>
-      </w:r>
-      <w:r>
-        <w:rPr>
-          <w:rFonts w:ascii="Times New Roman" w:hAnsi="Times New Roman" w:cs="Times New Roman"/>
-          <w:sz w:val="24"/>
-          <w:szCs w:val="24"/>
-        </w:rPr>
-        <w:t>s</w:t>
-      </w:r>
-      <w:r>
-        <w:rPr>
-          <w:rFonts w:ascii="Times New Roman" w:hAnsi="Times New Roman" w:cs="Times New Roman"/>
-          <w:sz w:val="24"/>
-          <w:szCs w:val="24"/>
-        </w:rPr>
-        <w:t>.</w:t>
+        <w:t>It allows the step-by-step construction of complex objects.</w:t>
       </w:r>
     </w:p>
     <w:p>
@@ -7285,18 +6623,8 @@
           <w:sz w:val="24"/>
           <w:szCs w:val="24"/>
         </w:rPr>
-        <w:t xml:space="preserve">Used in </w:t>
-      </w:r>
-      <w:proofErr w:type="spellStart"/>
-      <w:r>
-        <w:rPr>
-          <w:rFonts w:ascii="Times New Roman" w:hAnsi="Times New Roman" w:cs="Times New Roman"/>
-          <w:sz w:val="24"/>
-          <w:szCs w:val="24"/>
-        </w:rPr>
-        <w:t>UserServiceImpl</w:t>
-      </w:r>
-      <w:proofErr w:type="spellEnd"/>
+        <w:t>Used in UserServiceImpl</w:t>
+      </w:r>
     </w:p>
     <w:p>
       <w:pPr>
@@ -8213,25 +7541,7 @@
           <w:sz w:val="24"/>
           <w:szCs w:val="24"/>
         </w:rPr>
-        <w:t xml:space="preserve">The </w:t>
-      </w:r>
-      <w:proofErr w:type="spellStart"/>
-      <w:r>
-        <w:rPr>
-          <w:rFonts w:ascii="Times New Roman" w:hAnsi="Times New Roman" w:cs="Times New Roman"/>
-          <w:sz w:val="24"/>
-          <w:szCs w:val="24"/>
-        </w:rPr>
-        <w:t>CarKet</w:t>
-      </w:r>
-      <w:proofErr w:type="spellEnd"/>
-      <w:r>
-        <w:rPr>
-          <w:rFonts w:ascii="Times New Roman" w:hAnsi="Times New Roman" w:cs="Times New Roman"/>
-          <w:sz w:val="24"/>
-          <w:szCs w:val="24"/>
-        </w:rPr>
-        <w:t xml:space="preserve"> application uses a unified stack of Java, Spring Boot,</w:t>
+        <w:t>The CarKet application uses a unified stack of Java, Spring Boot,</w:t>
       </w:r>
       <w:r>
         <w:rPr>
@@ -8241,23 +7551,13 @@
         </w:rPr>
         <w:t xml:space="preserve"> </w:t>
       </w:r>
-      <w:proofErr w:type="spellStart"/>
-      <w:r>
-        <w:rPr>
-          <w:rFonts w:ascii="Times New Roman" w:hAnsi="Times New Roman" w:cs="Times New Roman"/>
-          <w:sz w:val="24"/>
-          <w:szCs w:val="24"/>
-        </w:rPr>
-        <w:t>Thymeleaf</w:t>
-      </w:r>
-      <w:proofErr w:type="spellEnd"/>
-      <w:r>
-        <w:rPr>
-          <w:rFonts w:ascii="Times New Roman" w:hAnsi="Times New Roman" w:cs="Times New Roman"/>
-          <w:sz w:val="24"/>
-          <w:szCs w:val="24"/>
-        </w:rPr>
-        <w:t xml:space="preserve">, and PostgreSQL to create a secure and reliable web platform. This specific combination of technologies was chosen because they work together as a single, integrated </w:t>
+      <w:r>
+        <w:rPr>
+          <w:rFonts w:ascii="Times New Roman" w:hAnsi="Times New Roman" w:cs="Times New Roman"/>
+          <w:sz w:val="24"/>
+          <w:szCs w:val="24"/>
+        </w:rPr>
+        <w:t xml:space="preserve">Thymeleaf, and PostgreSQL to create a secure and reliable web platform. This specific combination of technologies was chosen because they work together as a single, integrated </w:t>
       </w:r>
       <w:r>
         <w:rPr>
@@ -8369,23 +7669,13 @@
           <w:szCs w:val="24"/>
         </w:rPr>
       </w:pPr>
-      <w:proofErr w:type="spellStart"/>
-      <w:r>
-        <w:rPr>
-          <w:rFonts w:ascii="Times New Roman" w:hAnsi="Times New Roman" w:cs="Times New Roman"/>
-          <w:sz w:val="24"/>
-          <w:szCs w:val="24"/>
-        </w:rPr>
-        <w:t>Thymeleaf</w:t>
-      </w:r>
-      <w:proofErr w:type="spellEnd"/>
-      <w:r>
-        <w:rPr>
-          <w:rFonts w:ascii="Times New Roman" w:hAnsi="Times New Roman" w:cs="Times New Roman"/>
-          <w:sz w:val="24"/>
-          <w:szCs w:val="24"/>
-        </w:rPr>
-        <w:t xml:space="preserve"> (Templates)</w:t>
+      <w:r>
+        <w:rPr>
+          <w:rFonts w:ascii="Times New Roman" w:hAnsi="Times New Roman" w:cs="Times New Roman"/>
+          <w:sz w:val="24"/>
+          <w:szCs w:val="24"/>
+        </w:rPr>
+        <w:t>Thymeleaf (Templates)</w:t>
       </w:r>
     </w:p>
     <w:p>
@@ -8471,43 +7761,7 @@
           <w:sz w:val="24"/>
           <w:szCs w:val="24"/>
         </w:rPr>
-        <w:t xml:space="preserve">The source code is divided </w:t>
-      </w:r>
-      <w:proofErr w:type="gramStart"/>
-      <w:r>
-        <w:rPr>
-          <w:rFonts w:ascii="Times New Roman" w:hAnsi="Times New Roman" w:cs="Times New Roman"/>
-          <w:sz w:val="24"/>
-          <w:szCs w:val="24"/>
-        </w:rPr>
-        <w:t>in</w:t>
-      </w:r>
-      <w:proofErr w:type="gramEnd"/>
-      <w:r>
-        <w:rPr>
-          <w:rFonts w:ascii="Times New Roman" w:hAnsi="Times New Roman" w:cs="Times New Roman"/>
-          <w:sz w:val="24"/>
-          <w:szCs w:val="24"/>
-        </w:rPr>
-        <w:t xml:space="preserve"> more packages: configurations, controllers, </w:t>
-      </w:r>
-      <w:proofErr w:type="spellStart"/>
-      <w:r>
-        <w:rPr>
-          <w:rFonts w:ascii="Times New Roman" w:hAnsi="Times New Roman" w:cs="Times New Roman"/>
-          <w:sz w:val="24"/>
-          <w:szCs w:val="24"/>
-        </w:rPr>
-        <w:t>dto</w:t>
-      </w:r>
-      <w:proofErr w:type="spellEnd"/>
-      <w:r>
-        <w:rPr>
-          <w:rFonts w:ascii="Times New Roman" w:hAnsi="Times New Roman" w:cs="Times New Roman"/>
-          <w:sz w:val="24"/>
-          <w:szCs w:val="24"/>
-        </w:rPr>
-        <w:t>, model, repositories, services</w:t>
+        <w:t>The source code is divided in more packages: configurations, controllers, dto, model, repositories, services</w:t>
       </w:r>
     </w:p>
     <w:p>
@@ -8525,61 +7779,7 @@
           <w:sz w:val="24"/>
           <w:szCs w:val="24"/>
         </w:rPr>
-        <w:t xml:space="preserve">The resources are also divided </w:t>
-      </w:r>
-      <w:proofErr w:type="gramStart"/>
-      <w:r>
-        <w:rPr>
-          <w:rFonts w:ascii="Times New Roman" w:hAnsi="Times New Roman" w:cs="Times New Roman"/>
-          <w:sz w:val="24"/>
-          <w:szCs w:val="24"/>
-        </w:rPr>
-        <w:t>in</w:t>
-      </w:r>
-      <w:proofErr w:type="gramEnd"/>
-      <w:r>
-        <w:rPr>
-          <w:rFonts w:ascii="Times New Roman" w:hAnsi="Times New Roman" w:cs="Times New Roman"/>
-          <w:sz w:val="24"/>
-          <w:szCs w:val="24"/>
-        </w:rPr>
-        <w:t xml:space="preserve"> packages: static- consists of </w:t>
-      </w:r>
-      <w:proofErr w:type="spellStart"/>
-      <w:r>
-        <w:rPr>
-          <w:rFonts w:ascii="Times New Roman" w:hAnsi="Times New Roman" w:cs="Times New Roman"/>
-          <w:sz w:val="24"/>
-          <w:szCs w:val="24"/>
-        </w:rPr>
-        <w:t>css</w:t>
-      </w:r>
-      <w:proofErr w:type="spellEnd"/>
-      <w:r>
-        <w:rPr>
-          <w:rFonts w:ascii="Times New Roman" w:hAnsi="Times New Roman" w:cs="Times New Roman"/>
-          <w:sz w:val="24"/>
-          <w:szCs w:val="24"/>
-        </w:rPr>
-        <w:t xml:space="preserve">, </w:t>
-      </w:r>
-      <w:proofErr w:type="spellStart"/>
-      <w:r>
-        <w:rPr>
-          <w:rFonts w:ascii="Times New Roman" w:hAnsi="Times New Roman" w:cs="Times New Roman"/>
-          <w:sz w:val="24"/>
-          <w:szCs w:val="24"/>
-        </w:rPr>
-        <w:t>js</w:t>
-      </w:r>
-      <w:proofErr w:type="spellEnd"/>
-      <w:r>
-        <w:rPr>
-          <w:rFonts w:ascii="Times New Roman" w:hAnsi="Times New Roman" w:cs="Times New Roman"/>
-          <w:sz w:val="24"/>
-          <w:szCs w:val="24"/>
-        </w:rPr>
-        <w:t>, and uploads for the ad pictures</w:t>
+        <w:t>The resources are also divided in packages: static- consists of css, js, and uploads for the ad pictures</w:t>
       </w:r>
       <w:r>
         <w:rPr>
@@ -8658,22 +7858,7 @@
           <w:szCs w:val="24"/>
         </w:rPr>
         <w:tab/>
-      </w:r>
-      <w:r>
-        <w:rPr>
-          <w:rFonts w:ascii="Times New Roman" w:hAnsi="Times New Roman" w:cs="Times New Roman"/>
-          <w:sz w:val="24"/>
-          <w:szCs w:val="24"/>
-        </w:rPr>
-        <w:t xml:space="preserve">The </w:t>
-      </w:r>
-      <w:r>
-        <w:rPr>
-          <w:rFonts w:ascii="Times New Roman" w:hAnsi="Times New Roman" w:cs="Times New Roman"/>
-          <w:sz w:val="24"/>
-          <w:szCs w:val="24"/>
-        </w:rPr>
-        <w:t xml:space="preserve">user is prompted on the log in page, where they have 3 choices: log in if they already have an account, register if they don’t have one, or continue as a guest, if they only want to search for cars, but not publish any ads. </w:t>
+        <w:t xml:space="preserve">The user is prompted on the log in page, where they have 3 choices: log in if they already have an account, register if they don’t have one, or continue as a guest, if they only want to search for cars, but not publish any ads. </w:t>
       </w:r>
     </w:p>
     <w:p>
@@ -8691,25 +7876,7 @@
           <w:szCs w:val="24"/>
         </w:rPr>
         <w:tab/>
-        <w:t xml:space="preserve">After that, the user is taken on the sale page, where they have a form to fill out </w:t>
-      </w:r>
-      <w:proofErr w:type="gramStart"/>
-      <w:r>
-        <w:rPr>
-          <w:rFonts w:ascii="Times New Roman" w:hAnsi="Times New Roman" w:cs="Times New Roman"/>
-          <w:sz w:val="24"/>
-          <w:szCs w:val="24"/>
-        </w:rPr>
-        <w:t>in order to</w:t>
-      </w:r>
-      <w:proofErr w:type="gramEnd"/>
-      <w:r>
-        <w:rPr>
-          <w:rFonts w:ascii="Times New Roman" w:hAnsi="Times New Roman" w:cs="Times New Roman"/>
-          <w:sz w:val="24"/>
-          <w:szCs w:val="24"/>
-        </w:rPr>
-        <w:t xml:space="preserve"> publish the advertisement. They can change pages with the buttons on the top bar: the bill for the sale page, the magnifying glass for the search page, and the user for their own ads. Each ad can be clicked, and its details are shown, as well as 2 buttons that may or may not appear based on the role of each client. The admin and the ad owner can delete the ad, and the ad owner can edit the price.</w:t>
+        <w:t>After that, the user is taken on the sale page, where they have a form to fill out in order to publish the advertisement. They can change pages with the buttons on the top bar: the bill for the sale page, the magnifying glass for the search page, and the user for their own ads. Each ad can be clicked, and its details are shown, as well as 2 buttons that may or may not appear based on the role of each client. The admin and the ad owner can delete the ad, and the ad owner can edit the price.</w:t>
       </w:r>
     </w:p>
     <w:p>
@@ -8809,47 +7976,7 @@
           <w:sz w:val="24"/>
           <w:szCs w:val="24"/>
         </w:rPr>
-        <w:t xml:space="preserve">The application was tested manually, using Postman too, </w:t>
-      </w:r>
-      <w:proofErr w:type="gramStart"/>
-      <w:r>
-        <w:rPr>
-          <w:rFonts w:ascii="Times New Roman" w:hAnsi="Times New Roman" w:cs="Times New Roman"/>
-          <w:w w:val="105"/>
-          <w:sz w:val="24"/>
-          <w:szCs w:val="24"/>
-        </w:rPr>
-        <w:t>in order to</w:t>
-      </w:r>
-      <w:proofErr w:type="gramEnd"/>
-      <w:r>
-        <w:rPr>
-          <w:rFonts w:ascii="Times New Roman" w:hAnsi="Times New Roman" w:cs="Times New Roman"/>
-          <w:w w:val="105"/>
-          <w:sz w:val="24"/>
-          <w:szCs w:val="24"/>
-        </w:rPr>
-        <w:t xml:space="preserve"> check every </w:t>
-      </w:r>
-      <w:proofErr w:type="spellStart"/>
-      <w:r>
-        <w:rPr>
-          <w:rFonts w:ascii="Times New Roman" w:hAnsi="Times New Roman" w:cs="Times New Roman"/>
-          <w:w w:val="105"/>
-          <w:sz w:val="24"/>
-          <w:szCs w:val="24"/>
-        </w:rPr>
-        <w:t>api</w:t>
-      </w:r>
-      <w:proofErr w:type="spellEnd"/>
-      <w:r>
-        <w:rPr>
-          <w:rFonts w:ascii="Times New Roman" w:hAnsi="Times New Roman" w:cs="Times New Roman"/>
-          <w:w w:val="105"/>
-          <w:sz w:val="24"/>
-          <w:szCs w:val="24"/>
-        </w:rPr>
-        <w:t xml:space="preserve"> call before implementing the UI, and then, after UI was implemented, it was tested again, with every edge case I could think of. </w:t>
+        <w:t xml:space="preserve">The application was tested manually, using Postman too, in order to check every api call before implementing the UI, and then, after UI was implemented, it was tested again, with every edge case I could think of. </w:t>
       </w:r>
     </w:p>
     <w:sectPr>
@@ -12260,6 +11387,7 @@
   <w:style w:type="character" w:default="1" w:styleId="DefaultParagraphFont">
     <w:name w:val="Default Paragraph Font"/>
     <w:uiPriority w:val="1"/>
+    <w:semiHidden/>
     <w:unhideWhenUsed/>
   </w:style>
   <w:style w:type="table" w:default="1" w:styleId="TableNormal">

</xml_diff>